<commit_message>
feat: enhance PDF generator retries, background deletion queue, and email batching
</commit_message>
<xml_diff>
--- a/rsp-dashboard/public/templates/Notice of Requirements - Promotion.docx
+++ b/rsp-dashboard/public/templates/Notice of Requirements - Promotion.docx
@@ -656,8 +656,9 @@
           <w:sz w:val="14"/>
           <w:szCs w:val="14"/>
         </w:rPr>
-        <w:t>including original</w:t>
-      </w:r>
+        <w:t xml:space="preserve">including </w:t>
+      </w:r>
+      <w:proofErr w:type="gramStart"/>
       <w:r>
         <w:rPr>
           <w:rFonts w:ascii="Nirmala UI" w:hAnsi="Nirmala UI" w:cs="Nirmala UI"/>
@@ -665,6 +666,15 @@
           <w:sz w:val="14"/>
           <w:szCs w:val="14"/>
         </w:rPr>
+        <w:t>original</w:t>
+      </w:r>
+      <w:r>
+        <w:rPr>
+          <w:rFonts w:ascii="Nirmala UI" w:hAnsi="Nirmala UI" w:cs="Nirmala UI"/>
+          <w:color w:val="365F91" w:themeColor="accent1" w:themeShade="BF"/>
+          <w:sz w:val="14"/>
+          <w:szCs w:val="14"/>
+        </w:rPr>
         <w:t xml:space="preserve"> </w:t>
       </w:r>
       <w:r>
@@ -682,7 +692,16 @@
           <w:sz w:val="14"/>
           <w:szCs w:val="14"/>
         </w:rPr>
-        <w:t xml:space="preserve">– </w:t>
+        <w:t>–</w:t>
+      </w:r>
+      <w:proofErr w:type="gramEnd"/>
+      <w:r>
+        <w:rPr>
+          <w:rFonts w:ascii="Nirmala UI" w:hAnsi="Nirmala UI" w:cs="Nirmala UI"/>
+          <w:sz w:val="14"/>
+          <w:szCs w:val="14"/>
+        </w:rPr>
+        <w:t xml:space="preserve"> </w:t>
       </w:r>
       <w:r>
         <w:rPr>
@@ -852,7 +871,25 @@
           <w:sz w:val="14"/>
           <w:szCs w:val="14"/>
         </w:rPr>
-        <w:t xml:space="preserve">2 authenticated copies and 1 photocopy – Special Order (SO) of Graduation for private/non-accredited school/s if SO number is not reflected on TOR </w:t>
+        <w:t xml:space="preserve">2 authenticated copies and 1 photocopy – Special Order (SO) of Graduation for private/non-accredited school/s if </w:t>
+      </w:r>
+      <w:proofErr w:type="gramStart"/>
+      <w:r>
+        <w:rPr>
+          <w:rFonts w:ascii="Nirmala UI" w:hAnsi="Nirmala UI" w:cs="Nirmala UI"/>
+          <w:sz w:val="14"/>
+          <w:szCs w:val="14"/>
+        </w:rPr>
+        <w:t>SO</w:t>
+      </w:r>
+      <w:proofErr w:type="gramEnd"/>
+      <w:r>
+        <w:rPr>
+          <w:rFonts w:ascii="Nirmala UI" w:hAnsi="Nirmala UI" w:cs="Nirmala UI"/>
+          <w:sz w:val="14"/>
+          <w:szCs w:val="14"/>
+        </w:rPr>
+        <w:t xml:space="preserve"> number is not reflected on TOR </w:t>
       </w:r>
       <w:r>
         <w:rPr>
@@ -1951,8 +1988,12 @@
       </w:pPr>
     </w:p>
     <w:sectPr>
-      <w:headerReference w:type="default" r:id="rId8"/>
-      <w:footerReference w:type="default" r:id="rId9"/>
+      <w:headerReference w:type="even" r:id="rId8"/>
+      <w:headerReference w:type="default" r:id="rId9"/>
+      <w:footerReference w:type="even" r:id="rId10"/>
+      <w:footerReference w:type="default" r:id="rId11"/>
+      <w:headerReference w:type="first" r:id="rId12"/>
+      <w:footerReference w:type="first" r:id="rId13"/>
       <w:pgSz w:w="11880" w:h="16920" w:code="9"/>
       <w:pgMar w:top="720" w:right="1440" w:bottom="720" w:left="1440" w:header="432" w:footer="864" w:gutter="0"/>
       <w:cols w:space="720"/>
@@ -1989,7 +2030,16 @@
 
 <file path=word/footer1.xml><?xml version="1.0" encoding="utf-8"?>
 <w:ftr xmlns:wpc="http://schemas.microsoft.com/office/word/2010/wordprocessingCanvas" xmlns:cx="http://schemas.microsoft.com/office/drawing/2014/chartex" xmlns:cx1="http://schemas.microsoft.com/office/drawing/2015/9/8/chartex" xmlns:cx2="http://schemas.microsoft.com/office/drawing/2015/10/21/chartex" xmlns:cx3="http://schemas.microsoft.com/office/drawing/2016/5/9/chartex" xmlns:cx4="http://schemas.microsoft.com/office/drawing/2016/5/10/chartex" xmlns:cx5="http://schemas.microsoft.com/office/drawing/2016/5/11/chartex" xmlns:cx6="http://schemas.microsoft.com/office/drawing/2016/5/12/chartex" xmlns:cx7="http://schemas.microsoft.com/office/drawing/2016/5/13/chartex" xmlns:cx8="http://schemas.microsoft.com/office/drawing/2016/5/14/chartex" xmlns:mc="http://schemas.openxmlformats.org/markup-compatibility/2006" xmlns:aink="http://schemas.microsoft.com/office/drawing/2016/ink" xmlns:am3d="http://schemas.microsoft.com/office/drawing/2017/model3d" xmlns:o="urn:schemas-microsoft-com:office:office" xmlns:oel="http://schemas.microsoft.com/office/2019/extlst" xmlns:r="http://schemas.openxmlformats.org/officeDocument/2006/relationships" xmlns:m="http://schemas.openxmlformats.org/officeDocument/2006/math" xmlns:v="urn:schemas-microsoft-com:vml" xmlns:wp14="http://schemas.microsoft.com/office/word/2010/wordprocessingDrawing" xmlns:wp="http://schemas.openxmlformats.org/drawingml/2006/wordprocessingDrawing" xmlns:w10="urn:schemas-microsoft-com:office:word" xmlns:w="http://schemas.openxmlformats.org/wordprocessingml/2006/main" xmlns:w14="http://schemas.microsoft.com/office/word/2010/wordml" xmlns:w15="http://schemas.microsoft.com/office/word/2012/wordml" xmlns:w16cex="http://schemas.microsoft.com/office/word/2018/wordml/cex" xmlns:w16cid="http://schemas.microsoft.com/office/word/2016/wordml/cid" xmlns:w16="http://schemas.microsoft.com/office/word/2018/wordml" xmlns:w16du="http://schemas.microsoft.com/office/word/2023/wordml/word16du" xmlns:w16sdtdh="http://schemas.microsoft.com/office/word/2020/wordml/sdtdatahash" xmlns:w16sdtfl="http://schemas.microsoft.com/office/word/2024/wordml/sdtformatlock" xmlns:w16se="http://schemas.microsoft.com/office/word/2015/wordml/symex" xmlns:wpg="http://schemas.microsoft.com/office/word/2010/wordprocessingGroup" xmlns:wpi="http://schemas.microsoft.com/office/word/2010/wordprocessingInk" xmlns:wne="http://schemas.microsoft.com/office/word/2006/wordml" xmlns:wps="http://schemas.microsoft.com/office/word/2010/wordprocessingShape" mc:Ignorable="w14 w15 w16se w16cid w16 w16cex w16sdtdh w16sdtfl w16du wp14">
-  <w:bookmarkStart w:id="1" w:name="_Hlk189835591"/>
+  <w:p>
+    <w:pPr>
+      <w:pStyle w:val="Footer"/>
+    </w:pPr>
+  </w:p>
+</w:ftr>
+</file>
+
+<file path=word/footer2.xml><?xml version="1.0" encoding="utf-8"?>
+<w:ftr xmlns:wpc="http://schemas.microsoft.com/office/word/2010/wordprocessingCanvas" xmlns:cx="http://schemas.microsoft.com/office/drawing/2014/chartex" xmlns:cx1="http://schemas.microsoft.com/office/drawing/2015/9/8/chartex" xmlns:cx2="http://schemas.microsoft.com/office/drawing/2015/10/21/chartex" xmlns:cx3="http://schemas.microsoft.com/office/drawing/2016/5/9/chartex" xmlns:cx4="http://schemas.microsoft.com/office/drawing/2016/5/10/chartex" xmlns:cx5="http://schemas.microsoft.com/office/drawing/2016/5/11/chartex" xmlns:cx6="http://schemas.microsoft.com/office/drawing/2016/5/12/chartex" xmlns:cx7="http://schemas.microsoft.com/office/drawing/2016/5/13/chartex" xmlns:cx8="http://schemas.microsoft.com/office/drawing/2016/5/14/chartex" xmlns:mc="http://schemas.openxmlformats.org/markup-compatibility/2006" xmlns:aink="http://schemas.microsoft.com/office/drawing/2016/ink" xmlns:am3d="http://schemas.microsoft.com/office/drawing/2017/model3d" xmlns:o="urn:schemas-microsoft-com:office:office" xmlns:oel="http://schemas.microsoft.com/office/2019/extlst" xmlns:r="http://schemas.openxmlformats.org/officeDocument/2006/relationships" xmlns:m="http://schemas.openxmlformats.org/officeDocument/2006/math" xmlns:v="urn:schemas-microsoft-com:vml" xmlns:wp14="http://schemas.microsoft.com/office/word/2010/wordprocessingDrawing" xmlns:wp="http://schemas.openxmlformats.org/drawingml/2006/wordprocessingDrawing" xmlns:w10="urn:schemas-microsoft-com:office:word" xmlns:w="http://schemas.openxmlformats.org/wordprocessingml/2006/main" xmlns:w14="http://schemas.microsoft.com/office/word/2010/wordml" xmlns:w15="http://schemas.microsoft.com/office/word/2012/wordml" xmlns:w16cex="http://schemas.microsoft.com/office/word/2018/wordml/cex" xmlns:w16cid="http://schemas.microsoft.com/office/word/2016/wordml/cid" xmlns:w16="http://schemas.microsoft.com/office/word/2018/wordml" xmlns:w16du="http://schemas.microsoft.com/office/word/2023/wordml/word16du" xmlns:w16sdtdh="http://schemas.microsoft.com/office/word/2020/wordml/sdtdatahash" xmlns:w16sdtfl="http://schemas.microsoft.com/office/word/2024/wordml/sdtformatlock" xmlns:w16se="http://schemas.microsoft.com/office/word/2015/wordml/symex" xmlns:wpg="http://schemas.microsoft.com/office/word/2010/wordprocessingGroup" xmlns:wpi="http://schemas.microsoft.com/office/word/2010/wordprocessingInk" xmlns:wne="http://schemas.microsoft.com/office/word/2006/wordml" xmlns:wps="http://schemas.microsoft.com/office/word/2010/wordprocessingShape" mc:Ignorable="w14 w15 w16se w16cid w16 w16cex w16sdtdh w16sdtfl w16du wp14">
   <w:p>
     <w:pPr>
       <w:rPr>
@@ -1997,6 +2047,7 @@
         <w14:ligatures w14:val="standardContextual"/>
       </w:rPr>
     </w:pPr>
+    <w:bookmarkStart w:id="1" w:name="_Hlk189835591"/>
     <w:r>
       <w:rPr>
         <w:noProof/>
@@ -2124,7 +2175,25 @@
                               <w:sz w:val="20"/>
                               <w:szCs w:val="20"/>
                             </w:rPr>
-                            <w:t>www.depediligan.com</w:t>
+                            <w:t>www.</w:t>
+                          </w:r>
+                          <w:r>
+                            <w:rPr>
+                              <w:rFonts w:cstheme="minorHAnsi"/>
+                              <w:bCs/>
+                              <w:sz w:val="20"/>
+                              <w:szCs w:val="20"/>
+                            </w:rPr>
+                            <w:t>iligan.deped10</w:t>
+                          </w:r>
+                          <w:r>
+                            <w:rPr>
+                              <w:rFonts w:cstheme="minorHAnsi"/>
+                              <w:bCs/>
+                              <w:sz w:val="20"/>
+                              <w:szCs w:val="20"/>
+                            </w:rPr>
+                            <w:t>.com</w:t>
                           </w:r>
                         </w:p>
                       </w:txbxContent>
@@ -2234,7 +2303,25 @@
                         <w:sz w:val="20"/>
                         <w:szCs w:val="20"/>
                       </w:rPr>
-                      <w:t>www.depediligan.com</w:t>
+                      <w:t>www.</w:t>
+                    </w:r>
+                    <w:r>
+                      <w:rPr>
+                        <w:rFonts w:cstheme="minorHAnsi"/>
+                        <w:bCs/>
+                        <w:sz w:val="20"/>
+                        <w:szCs w:val="20"/>
+                      </w:rPr>
+                      <w:t>iligan.deped10</w:t>
+                    </w:r>
+                    <w:r>
+                      <w:rPr>
+                        <w:rFonts w:cstheme="minorHAnsi"/>
+                        <w:bCs/>
+                        <w:sz w:val="20"/>
+                        <w:szCs w:val="20"/>
+                      </w:rPr>
+                      <w:t>.com</w:t>
                     </w:r>
                   </w:p>
                 </w:txbxContent>
@@ -2836,11 +2923,7 @@
         </mc:Choice>
         <mc:Fallback>
           <w:pict>
-            <v:shapetype w14:anchorId="098F1ADA" id="_x0000_t202" coordsize="21600,21600" o:spt="202" path="m,l,21600r21600,l21600,xe">
-              <v:stroke joinstyle="miter"/>
-              <v:path gradientshapeok="t" o:connecttype="rect"/>
-            </v:shapetype>
-            <v:shape id="Text Box 3" o:spid="_x0000_s1027" type="#_x0000_t202" style="position:absolute;margin-left:222.5pt;margin-top:21.45pt;width:166.4pt;height:23.6pt;z-index:251665408;visibility:visible;mso-wrap-style:square;mso-width-percent:0;mso-height-percent:0;mso-wrap-distance-left:9pt;mso-wrap-distance-top:0;mso-wrap-distance-right:9pt;mso-wrap-distance-bottom:0;mso-position-horizontal:absolute;mso-position-horizontal-relative:text;mso-position-vertical:absolute;mso-position-vertical-relative:text;mso-width-percent:0;mso-height-percent:0;mso-width-relative:page;mso-height-relative:page;v-text-anchor:top" o:gfxdata="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" stroked="f">
+            <v:shape w14:anchorId="098F1ADA" id="Text Box 3" o:spid="_x0000_s1027" type="#_x0000_t202" style="position:absolute;margin-left:222.5pt;margin-top:21.45pt;width:166.4pt;height:23.6pt;z-index:251665408;visibility:visible;mso-wrap-style:square;mso-width-percent:0;mso-height-percent:0;mso-wrap-distance-left:9pt;mso-wrap-distance-top:0;mso-wrap-distance-right:9pt;mso-wrap-distance-bottom:0;mso-position-horizontal:absolute;mso-position-horizontal-relative:text;mso-position-vertical:absolute;mso-position-vertical-relative:text;mso-width-percent:0;mso-height-percent:0;mso-width-relative:page;mso-height-relative:page;v-text-anchor:top" o:gfxdata="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" stroked="f">
               <v:textbox inset="1.44pt,0,0,0">
                 <w:txbxContent>
                   <w:tbl>
@@ -3160,6 +3243,16 @@
 </w:ftr>
 </file>
 
+<file path=word/footer3.xml><?xml version="1.0" encoding="utf-8"?>
+<w:ftr xmlns:wpc="http://schemas.microsoft.com/office/word/2010/wordprocessingCanvas" xmlns:cx="http://schemas.microsoft.com/office/drawing/2014/chartex" xmlns:cx1="http://schemas.microsoft.com/office/drawing/2015/9/8/chartex" xmlns:cx2="http://schemas.microsoft.com/office/drawing/2015/10/21/chartex" xmlns:cx3="http://schemas.microsoft.com/office/drawing/2016/5/9/chartex" xmlns:cx4="http://schemas.microsoft.com/office/drawing/2016/5/10/chartex" xmlns:cx5="http://schemas.microsoft.com/office/drawing/2016/5/11/chartex" xmlns:cx6="http://schemas.microsoft.com/office/drawing/2016/5/12/chartex" xmlns:cx7="http://schemas.microsoft.com/office/drawing/2016/5/13/chartex" xmlns:cx8="http://schemas.microsoft.com/office/drawing/2016/5/14/chartex" xmlns:mc="http://schemas.openxmlformats.org/markup-compatibility/2006" xmlns:aink="http://schemas.microsoft.com/office/drawing/2016/ink" xmlns:am3d="http://schemas.microsoft.com/office/drawing/2017/model3d" xmlns:o="urn:schemas-microsoft-com:office:office" xmlns:oel="http://schemas.microsoft.com/office/2019/extlst" xmlns:r="http://schemas.openxmlformats.org/officeDocument/2006/relationships" xmlns:m="http://schemas.openxmlformats.org/officeDocument/2006/math" xmlns:v="urn:schemas-microsoft-com:vml" xmlns:wp14="http://schemas.microsoft.com/office/word/2010/wordprocessingDrawing" xmlns:wp="http://schemas.openxmlformats.org/drawingml/2006/wordprocessingDrawing" xmlns:w10="urn:schemas-microsoft-com:office:word" xmlns:w="http://schemas.openxmlformats.org/wordprocessingml/2006/main" xmlns:w14="http://schemas.microsoft.com/office/word/2010/wordml" xmlns:w15="http://schemas.microsoft.com/office/word/2012/wordml" xmlns:w16cex="http://schemas.microsoft.com/office/word/2018/wordml/cex" xmlns:w16cid="http://schemas.microsoft.com/office/word/2016/wordml/cid" xmlns:w16="http://schemas.microsoft.com/office/word/2018/wordml" xmlns:w16du="http://schemas.microsoft.com/office/word/2023/wordml/word16du" xmlns:w16sdtdh="http://schemas.microsoft.com/office/word/2020/wordml/sdtdatahash" xmlns:w16sdtfl="http://schemas.microsoft.com/office/word/2024/wordml/sdtformatlock" xmlns:w16se="http://schemas.microsoft.com/office/word/2015/wordml/symex" xmlns:wpg="http://schemas.microsoft.com/office/word/2010/wordprocessingGroup" xmlns:wpi="http://schemas.microsoft.com/office/word/2010/wordprocessingInk" xmlns:wne="http://schemas.microsoft.com/office/word/2006/wordml" xmlns:wps="http://schemas.microsoft.com/office/word/2010/wordprocessingShape" mc:Ignorable="w14 w15 w16se w16cid w16 w16cex w16sdtdh w16sdtfl w16du wp14">
+  <w:p>
+    <w:pPr>
+      <w:pStyle w:val="Footer"/>
+    </w:pPr>
+  </w:p>
+</w:ftr>
+</file>
+
 <file path=word/footnotes.xml><?xml version="1.0" encoding="utf-8"?>
 <w:footnotes xmlns:wpc="http://schemas.microsoft.com/office/word/2010/wordprocessingCanvas" xmlns:cx="http://schemas.microsoft.com/office/drawing/2014/chartex" xmlns:cx1="http://schemas.microsoft.com/office/drawing/2015/9/8/chartex" xmlns:cx2="http://schemas.microsoft.com/office/drawing/2015/10/21/chartex" xmlns:cx3="http://schemas.microsoft.com/office/drawing/2016/5/9/chartex" xmlns:cx4="http://schemas.microsoft.com/office/drawing/2016/5/10/chartex" xmlns:cx5="http://schemas.microsoft.com/office/drawing/2016/5/11/chartex" xmlns:cx6="http://schemas.microsoft.com/office/drawing/2016/5/12/chartex" xmlns:cx7="http://schemas.microsoft.com/office/drawing/2016/5/13/chartex" xmlns:cx8="http://schemas.microsoft.com/office/drawing/2016/5/14/chartex" xmlns:mc="http://schemas.openxmlformats.org/markup-compatibility/2006" xmlns:aink="http://schemas.microsoft.com/office/drawing/2016/ink" xmlns:am3d="http://schemas.microsoft.com/office/drawing/2017/model3d" xmlns:o="urn:schemas-microsoft-com:office:office" xmlns:oel="http://schemas.microsoft.com/office/2019/extlst" xmlns:r="http://schemas.openxmlformats.org/officeDocument/2006/relationships" xmlns:m="http://schemas.openxmlformats.org/officeDocument/2006/math" xmlns:v="urn:schemas-microsoft-com:vml" xmlns:wp14="http://schemas.microsoft.com/office/word/2010/wordprocessingDrawing" xmlns:wp="http://schemas.openxmlformats.org/drawingml/2006/wordprocessingDrawing" xmlns:w10="urn:schemas-microsoft-com:office:word" xmlns:w="http://schemas.openxmlformats.org/wordprocessingml/2006/main" xmlns:w14="http://schemas.microsoft.com/office/word/2010/wordml" xmlns:w15="http://schemas.microsoft.com/office/word/2012/wordml" xmlns:w16cex="http://schemas.microsoft.com/office/word/2018/wordml/cex" xmlns:w16cid="http://schemas.microsoft.com/office/word/2016/wordml/cid" xmlns:w16="http://schemas.microsoft.com/office/word/2018/wordml" xmlns:w16du="http://schemas.microsoft.com/office/word/2023/wordml/word16du" xmlns:w16sdtdh="http://schemas.microsoft.com/office/word/2020/wordml/sdtdatahash" xmlns:w16sdtfl="http://schemas.microsoft.com/office/word/2024/wordml/sdtformatlock" xmlns:w16se="http://schemas.microsoft.com/office/word/2015/wordml/symex" xmlns:wpg="http://schemas.microsoft.com/office/word/2010/wordprocessingGroup" xmlns:wpi="http://schemas.microsoft.com/office/word/2010/wordprocessingInk" xmlns:wne="http://schemas.microsoft.com/office/word/2006/wordml" xmlns:wps="http://schemas.microsoft.com/office/word/2010/wordprocessingShape" mc:Ignorable="w14 w15 w16se w16cid w16 w16cex w16sdtdh w16sdtfl w16du wp14">
   <w:footnote w:type="separator" w:id="-1">
@@ -3186,6 +3279,16 @@
 </file>
 
 <file path=word/header1.xml><?xml version="1.0" encoding="utf-8"?>
+<w:hdr xmlns:wpc="http://schemas.microsoft.com/office/word/2010/wordprocessingCanvas" xmlns:cx="http://schemas.microsoft.com/office/drawing/2014/chartex" xmlns:cx1="http://schemas.microsoft.com/office/drawing/2015/9/8/chartex" xmlns:cx2="http://schemas.microsoft.com/office/drawing/2015/10/21/chartex" xmlns:cx3="http://schemas.microsoft.com/office/drawing/2016/5/9/chartex" xmlns:cx4="http://schemas.microsoft.com/office/drawing/2016/5/10/chartex" xmlns:cx5="http://schemas.microsoft.com/office/drawing/2016/5/11/chartex" xmlns:cx6="http://schemas.microsoft.com/office/drawing/2016/5/12/chartex" xmlns:cx7="http://schemas.microsoft.com/office/drawing/2016/5/13/chartex" xmlns:cx8="http://schemas.microsoft.com/office/drawing/2016/5/14/chartex" xmlns:mc="http://schemas.openxmlformats.org/markup-compatibility/2006" xmlns:aink="http://schemas.microsoft.com/office/drawing/2016/ink" xmlns:am3d="http://schemas.microsoft.com/office/drawing/2017/model3d" xmlns:o="urn:schemas-microsoft-com:office:office" xmlns:oel="http://schemas.microsoft.com/office/2019/extlst" xmlns:r="http://schemas.openxmlformats.org/officeDocument/2006/relationships" xmlns:m="http://schemas.openxmlformats.org/officeDocument/2006/math" xmlns:v="urn:schemas-microsoft-com:vml" xmlns:wp14="http://schemas.microsoft.com/office/word/2010/wordprocessingDrawing" xmlns:wp="http://schemas.openxmlformats.org/drawingml/2006/wordprocessingDrawing" xmlns:w10="urn:schemas-microsoft-com:office:word" xmlns:w="http://schemas.openxmlformats.org/wordprocessingml/2006/main" xmlns:w14="http://schemas.microsoft.com/office/word/2010/wordml" xmlns:w15="http://schemas.microsoft.com/office/word/2012/wordml" xmlns:w16cex="http://schemas.microsoft.com/office/word/2018/wordml/cex" xmlns:w16cid="http://schemas.microsoft.com/office/word/2016/wordml/cid" xmlns:w16="http://schemas.microsoft.com/office/word/2018/wordml" xmlns:w16du="http://schemas.microsoft.com/office/word/2023/wordml/word16du" xmlns:w16sdtdh="http://schemas.microsoft.com/office/word/2020/wordml/sdtdatahash" xmlns:w16sdtfl="http://schemas.microsoft.com/office/word/2024/wordml/sdtformatlock" xmlns:w16se="http://schemas.microsoft.com/office/word/2015/wordml/symex" xmlns:wpg="http://schemas.microsoft.com/office/word/2010/wordprocessingGroup" xmlns:wpi="http://schemas.microsoft.com/office/word/2010/wordprocessingInk" xmlns:wne="http://schemas.microsoft.com/office/word/2006/wordml" xmlns:wps="http://schemas.microsoft.com/office/word/2010/wordprocessingShape" mc:Ignorable="w14 w15 w16se w16cid w16 w16cex w16sdtdh w16sdtfl w16du wp14">
+  <w:p>
+    <w:pPr>
+      <w:pStyle w:val="Header"/>
+    </w:pPr>
+  </w:p>
+</w:hdr>
+</file>
+
+<file path=word/header2.xml><?xml version="1.0" encoding="utf-8"?>
 <w:hdr xmlns:wpc="http://schemas.microsoft.com/office/word/2010/wordprocessingCanvas" xmlns:cx="http://schemas.microsoft.com/office/drawing/2014/chartex" xmlns:cx1="http://schemas.microsoft.com/office/drawing/2015/9/8/chartex" xmlns:cx2="http://schemas.microsoft.com/office/drawing/2015/10/21/chartex" xmlns:cx3="http://schemas.microsoft.com/office/drawing/2016/5/9/chartex" xmlns:cx4="http://schemas.microsoft.com/office/drawing/2016/5/10/chartex" xmlns:cx5="http://schemas.microsoft.com/office/drawing/2016/5/11/chartex" xmlns:cx6="http://schemas.microsoft.com/office/drawing/2016/5/12/chartex" xmlns:cx7="http://schemas.microsoft.com/office/drawing/2016/5/13/chartex" xmlns:cx8="http://schemas.microsoft.com/office/drawing/2016/5/14/chartex" xmlns:mc="http://schemas.openxmlformats.org/markup-compatibility/2006" xmlns:aink="http://schemas.microsoft.com/office/drawing/2016/ink" xmlns:am3d="http://schemas.microsoft.com/office/drawing/2017/model3d" xmlns:o="urn:schemas-microsoft-com:office:office" xmlns:oel="http://schemas.microsoft.com/office/2019/extlst" xmlns:r="http://schemas.openxmlformats.org/officeDocument/2006/relationships" xmlns:m="http://schemas.openxmlformats.org/officeDocument/2006/math" xmlns:v="urn:schemas-microsoft-com:vml" xmlns:wp14="http://schemas.microsoft.com/office/word/2010/wordprocessingDrawing" xmlns:wp="http://schemas.openxmlformats.org/drawingml/2006/wordprocessingDrawing" xmlns:w10="urn:schemas-microsoft-com:office:word" xmlns:w="http://schemas.openxmlformats.org/wordprocessingml/2006/main" xmlns:w14="http://schemas.microsoft.com/office/word/2010/wordml" xmlns:w15="http://schemas.microsoft.com/office/word/2012/wordml" xmlns:w16cex="http://schemas.microsoft.com/office/word/2018/wordml/cex" xmlns:w16cid="http://schemas.microsoft.com/office/word/2016/wordml/cid" xmlns:w16="http://schemas.microsoft.com/office/word/2018/wordml" xmlns:w16du="http://schemas.microsoft.com/office/word/2023/wordml/word16du" xmlns:w16sdtdh="http://schemas.microsoft.com/office/word/2020/wordml/sdtdatahash" xmlns:w16sdtfl="http://schemas.microsoft.com/office/word/2024/wordml/sdtformatlock" xmlns:w16se="http://schemas.microsoft.com/office/word/2015/wordml/symex" xmlns:wpg="http://schemas.microsoft.com/office/word/2010/wordprocessingGroup" xmlns:wpi="http://schemas.microsoft.com/office/word/2010/wordprocessingInk" xmlns:wne="http://schemas.microsoft.com/office/word/2006/wordml" xmlns:wps="http://schemas.microsoft.com/office/word/2010/wordprocessingShape" mc:Ignorable="w14 w15 w16se w16cid w16 w16cex w16sdtdh w16sdtfl w16du wp14">
   <w:sdt>
     <w:sdtPr>
@@ -3598,6 +3701,16 @@
       </w:rPr>
       <w:t xml:space="preserve"> </w:t>
     </w:r>
+  </w:p>
+</w:hdr>
+</file>
+
+<file path=word/header3.xml><?xml version="1.0" encoding="utf-8"?>
+<w:hdr xmlns:wpc="http://schemas.microsoft.com/office/word/2010/wordprocessingCanvas" xmlns:cx="http://schemas.microsoft.com/office/drawing/2014/chartex" xmlns:cx1="http://schemas.microsoft.com/office/drawing/2015/9/8/chartex" xmlns:cx2="http://schemas.microsoft.com/office/drawing/2015/10/21/chartex" xmlns:cx3="http://schemas.microsoft.com/office/drawing/2016/5/9/chartex" xmlns:cx4="http://schemas.microsoft.com/office/drawing/2016/5/10/chartex" xmlns:cx5="http://schemas.microsoft.com/office/drawing/2016/5/11/chartex" xmlns:cx6="http://schemas.microsoft.com/office/drawing/2016/5/12/chartex" xmlns:cx7="http://schemas.microsoft.com/office/drawing/2016/5/13/chartex" xmlns:cx8="http://schemas.microsoft.com/office/drawing/2016/5/14/chartex" xmlns:mc="http://schemas.openxmlformats.org/markup-compatibility/2006" xmlns:aink="http://schemas.microsoft.com/office/drawing/2016/ink" xmlns:am3d="http://schemas.microsoft.com/office/drawing/2017/model3d" xmlns:o="urn:schemas-microsoft-com:office:office" xmlns:oel="http://schemas.microsoft.com/office/2019/extlst" xmlns:r="http://schemas.openxmlformats.org/officeDocument/2006/relationships" xmlns:m="http://schemas.openxmlformats.org/officeDocument/2006/math" xmlns:v="urn:schemas-microsoft-com:vml" xmlns:wp14="http://schemas.microsoft.com/office/word/2010/wordprocessingDrawing" xmlns:wp="http://schemas.openxmlformats.org/drawingml/2006/wordprocessingDrawing" xmlns:w10="urn:schemas-microsoft-com:office:word" xmlns:w="http://schemas.openxmlformats.org/wordprocessingml/2006/main" xmlns:w14="http://schemas.microsoft.com/office/word/2010/wordml" xmlns:w15="http://schemas.microsoft.com/office/word/2012/wordml" xmlns:w16cex="http://schemas.microsoft.com/office/word/2018/wordml/cex" xmlns:w16cid="http://schemas.microsoft.com/office/word/2016/wordml/cid" xmlns:w16="http://schemas.microsoft.com/office/word/2018/wordml" xmlns:w16du="http://schemas.microsoft.com/office/word/2023/wordml/word16du" xmlns:w16sdtdh="http://schemas.microsoft.com/office/word/2020/wordml/sdtdatahash" xmlns:w16sdtfl="http://schemas.microsoft.com/office/word/2024/wordml/sdtformatlock" xmlns:w16se="http://schemas.microsoft.com/office/word/2015/wordml/symex" xmlns:wpg="http://schemas.microsoft.com/office/word/2010/wordprocessingGroup" xmlns:wpi="http://schemas.microsoft.com/office/word/2010/wordprocessingInk" xmlns:wne="http://schemas.microsoft.com/office/word/2006/wordml" xmlns:wps="http://schemas.microsoft.com/office/word/2010/wordprocessingShape" mc:Ignorable="w14 w15 w16se w16cid w16 w16cex w16sdtdh w16sdtfl w16du wp14">
+  <w:p>
+    <w:pPr>
+      <w:pStyle w:val="Header"/>
+    </w:pPr>
   </w:p>
 </w:hdr>
 </file>
@@ -5191,6 +5304,29 @@
       <w14:ligatures w14:val="none"/>
     </w:rPr>
   </w:style>
+  <w:style w:type="character" w:styleId="Hyperlink">
+    <w:name w:val="Hyperlink"/>
+    <w:basedOn w:val="DefaultParagraphFont"/>
+    <w:uiPriority w:val="99"/>
+    <w:unhideWhenUsed/>
+    <w:rsid w:val="00C36210"/>
+    <w:rPr>
+      <w:color w:val="0000FF" w:themeColor="hyperlink"/>
+      <w:u w:val="single"/>
+    </w:rPr>
+  </w:style>
+  <w:style w:type="character" w:styleId="UnresolvedMention">
+    <w:name w:val="Unresolved Mention"/>
+    <w:basedOn w:val="DefaultParagraphFont"/>
+    <w:uiPriority w:val="99"/>
+    <w:semiHidden/>
+    <w:unhideWhenUsed/>
+    <w:rsid w:val="00C36210"/>
+    <w:rPr>
+      <w:color w:val="605E5C"/>
+      <w:shd w:val="clear" w:color="auto" w:fill="E1DFDD"/>
+    </w:rPr>
+  </w:style>
 </w:styles>
 </file>
 

</xml_diff>